<commit_message>
Improve dashboard UI styling
</commit_message>
<xml_diff>
--- a/FINAL PROJECT REPORT.docx
+++ b/FINAL PROJECT REPORT.docx
@@ -3713,6 +3713,583 @@
       </w:r>
     </w:p>
     <w:p>
+      <w:pPr>
+        <w:rPr>
+          <w:b/>
+          <w:bCs/>
+        </w:rPr>
+      </w:pPr>
+      <w:r>
+        <w:rPr>
+          <w:b/>
+          <w:bCs/>
+        </w:rPr>
+        <w:t>11.7 System Integration and Testing</w:t>
+      </w:r>
+    </w:p>
+    <w:p>
+      <w:r>
+        <w:t xml:space="preserve">The different components of the Automated Threat Detection System were integrated to work together as a complete system. The dashboard collects network traffic inputs in the form of bytes and packets and sends them to the Flask API. The API validates the inputs and passes the valid data to the trained Random Forest model. The model classifies the traffic as </w:t>
+      </w:r>
+      <w:r>
+        <w:rPr>
+          <w:b/>
+          <w:bCs/>
+        </w:rPr>
+        <w:t>Normal Activity</w:t>
+      </w:r>
+      <w:r>
+        <w:t xml:space="preserve"> or </w:t>
+      </w:r>
+      <w:r>
+        <w:rPr>
+          <w:b/>
+          <w:bCs/>
+        </w:rPr>
+        <w:t>Threat Detected</w:t>
+      </w:r>
+      <w:r>
+        <w:t>, and the result is returned to the dashboard.</w:t>
+      </w:r>
+    </w:p>
+    <w:p>
+      <w:pPr>
+        <w:rPr>
+          <w:b/>
+          <w:bCs/>
+        </w:rPr>
+      </w:pPr>
+      <w:r>
+        <w:rPr>
+          <w:b/>
+          <w:bCs/>
+        </w:rPr>
+        <w:t>11.8 Integration Testing</w:t>
+      </w:r>
+    </w:p>
+    <w:p>
+      <w:r>
+        <w:t>The integrated system was tested using different valid network traffic values and invalid inputs. The dashboard, Flask API, Random Forest model, input validation, and deployed Render service were checked to ensure proper communication and functionality.</w:t>
+      </w:r>
+    </w:p>
+    <w:tbl>
+      <w:tblPr>
+        <w:tblW w:w="0" w:type="auto"/>
+        <w:tblCellSpacing w:w="15" w:type="dxa"/>
+        <w:tblCellMar>
+          <w:top w:w="15" w:type="dxa"/>
+          <w:left w:w="15" w:type="dxa"/>
+          <w:bottom w:w="15" w:type="dxa"/>
+          <w:right w:w="15" w:type="dxa"/>
+        </w:tblCellMar>
+        <w:tblLook w:val="04A0" w:firstRow="1" w:lastRow="0" w:firstColumn="1" w:lastColumn="0" w:noHBand="0" w:noVBand="1"/>
+      </w:tblPr>
+      <w:tblGrid>
+        <w:gridCol w:w="1654"/>
+        <w:gridCol w:w="2676"/>
+        <w:gridCol w:w="1720"/>
+        <w:gridCol w:w="784"/>
+      </w:tblGrid>
+      <w:tr>
+        <w:trPr>
+          <w:tblHeader/>
+          <w:tblCellSpacing w:w="15" w:type="dxa"/>
+        </w:trPr>
+        <w:tc>
+          <w:tcPr>
+            <w:tcW w:w="0" w:type="auto"/>
+            <w:vAlign w:val="center"/>
+            <w:hideMark/>
+          </w:tcPr>
+          <w:p>
+            <w:pPr>
+              <w:rPr>
+                <w:b/>
+                <w:bCs/>
+              </w:rPr>
+            </w:pPr>
+            <w:r>
+              <w:rPr>
+                <w:b/>
+                <w:bCs/>
+              </w:rPr>
+              <w:t>Test</w:t>
+            </w:r>
+          </w:p>
+        </w:tc>
+        <w:tc>
+          <w:tcPr>
+            <w:tcW w:w="0" w:type="auto"/>
+            <w:vAlign w:val="center"/>
+            <w:hideMark/>
+          </w:tcPr>
+          <w:p>
+            <w:pPr>
+              <w:rPr>
+                <w:b/>
+                <w:bCs/>
+              </w:rPr>
+            </w:pPr>
+            <w:r>
+              <w:rPr>
+                <w:b/>
+                <w:bCs/>
+              </w:rPr>
+              <w:t>Input</w:t>
+            </w:r>
+          </w:p>
+        </w:tc>
+        <w:tc>
+          <w:tcPr>
+            <w:tcW w:w="0" w:type="auto"/>
+            <w:vAlign w:val="center"/>
+            <w:hideMark/>
+          </w:tcPr>
+          <w:p>
+            <w:pPr>
+              <w:rPr>
+                <w:b/>
+                <w:bCs/>
+              </w:rPr>
+            </w:pPr>
+            <w:r>
+              <w:rPr>
+                <w:b/>
+                <w:bCs/>
+              </w:rPr>
+              <w:t>Result</w:t>
+            </w:r>
+          </w:p>
+        </w:tc>
+        <w:tc>
+          <w:tcPr>
+            <w:tcW w:w="0" w:type="auto"/>
+            <w:vAlign w:val="center"/>
+            <w:hideMark/>
+          </w:tcPr>
+          <w:p>
+            <w:pPr>
+              <w:rPr>
+                <w:b/>
+                <w:bCs/>
+              </w:rPr>
+            </w:pPr>
+            <w:r>
+              <w:rPr>
+                <w:b/>
+                <w:bCs/>
+              </w:rPr>
+              <w:t>Status</w:t>
+            </w:r>
+          </w:p>
+        </w:tc>
+      </w:tr>
+      <w:tr>
+        <w:trPr>
+          <w:tblCellSpacing w:w="15" w:type="dxa"/>
+        </w:trPr>
+        <w:tc>
+          <w:tcPr>
+            <w:tcW w:w="0" w:type="auto"/>
+            <w:vAlign w:val="center"/>
+            <w:hideMark/>
+          </w:tcPr>
+          <w:p>
+            <w:r>
+              <w:t>Valid traffic</w:t>
+            </w:r>
+          </w:p>
+        </w:tc>
+        <w:tc>
+          <w:tcPr>
+            <w:tcW w:w="0" w:type="auto"/>
+            <w:vAlign w:val="center"/>
+            <w:hideMark/>
+          </w:tcPr>
+          <w:p>
+            <w:r>
+              <w:t>5000 bytes, 100 packets</w:t>
+            </w:r>
+          </w:p>
+        </w:tc>
+        <w:tc>
+          <w:tcPr>
+            <w:tcW w:w="0" w:type="auto"/>
+            <w:vAlign w:val="center"/>
+            <w:hideMark/>
+          </w:tcPr>
+          <w:p>
+            <w:r>
+              <w:t>Threat Detected</w:t>
+            </w:r>
+          </w:p>
+        </w:tc>
+        <w:tc>
+          <w:tcPr>
+            <w:tcW w:w="0" w:type="auto"/>
+            <w:vAlign w:val="center"/>
+            <w:hideMark/>
+          </w:tcPr>
+          <w:p>
+            <w:r>
+              <w:t>Pass</w:t>
+            </w:r>
+          </w:p>
+        </w:tc>
+      </w:tr>
+      <w:tr>
+        <w:trPr>
+          <w:tblCellSpacing w:w="15" w:type="dxa"/>
+        </w:trPr>
+        <w:tc>
+          <w:tcPr>
+            <w:tcW w:w="0" w:type="auto"/>
+            <w:vAlign w:val="center"/>
+            <w:hideMark/>
+          </w:tcPr>
+          <w:p>
+            <w:r>
+              <w:t>Valid traffic</w:t>
+            </w:r>
+          </w:p>
+        </w:tc>
+        <w:tc>
+          <w:tcPr>
+            <w:tcW w:w="0" w:type="auto"/>
+            <w:vAlign w:val="center"/>
+            <w:hideMark/>
+          </w:tcPr>
+          <w:p>
+            <w:r>
+              <w:t>500 bytes, 10 packets</w:t>
+            </w:r>
+          </w:p>
+        </w:tc>
+        <w:tc>
+          <w:tcPr>
+            <w:tcW w:w="0" w:type="auto"/>
+            <w:vAlign w:val="center"/>
+            <w:hideMark/>
+          </w:tcPr>
+          <w:p>
+            <w:r>
+              <w:t>Threat Detected</w:t>
+            </w:r>
+          </w:p>
+        </w:tc>
+        <w:tc>
+          <w:tcPr>
+            <w:tcW w:w="0" w:type="auto"/>
+            <w:vAlign w:val="center"/>
+            <w:hideMark/>
+          </w:tcPr>
+          <w:p>
+            <w:r>
+              <w:t>Pass</w:t>
+            </w:r>
+          </w:p>
+        </w:tc>
+      </w:tr>
+      <w:tr>
+        <w:trPr>
+          <w:tblCellSpacing w:w="15" w:type="dxa"/>
+        </w:trPr>
+        <w:tc>
+          <w:tcPr>
+            <w:tcW w:w="0" w:type="auto"/>
+            <w:vAlign w:val="center"/>
+            <w:hideMark/>
+          </w:tcPr>
+          <w:p>
+            <w:r>
+              <w:t>Valid traffic</w:t>
+            </w:r>
+          </w:p>
+        </w:tc>
+        <w:tc>
+          <w:tcPr>
+            <w:tcW w:w="0" w:type="auto"/>
+            <w:vAlign w:val="center"/>
+            <w:hideMark/>
+          </w:tcPr>
+          <w:p>
+            <w:r>
+              <w:t>50 bytes, 2 packets</w:t>
+            </w:r>
+          </w:p>
+        </w:tc>
+        <w:tc>
+          <w:tcPr>
+            <w:tcW w:w="0" w:type="auto"/>
+            <w:vAlign w:val="center"/>
+            <w:hideMark/>
+          </w:tcPr>
+          <w:p>
+            <w:r>
+              <w:t>Threat Detected</w:t>
+            </w:r>
+          </w:p>
+        </w:tc>
+        <w:tc>
+          <w:tcPr>
+            <w:tcW w:w="0" w:type="auto"/>
+            <w:vAlign w:val="center"/>
+            <w:hideMark/>
+          </w:tcPr>
+          <w:p>
+            <w:r>
+              <w:t>Pass</w:t>
+            </w:r>
+          </w:p>
+        </w:tc>
+      </w:tr>
+      <w:tr>
+        <w:trPr>
+          <w:tblCellSpacing w:w="15" w:type="dxa"/>
+        </w:trPr>
+        <w:tc>
+          <w:tcPr>
+            <w:tcW w:w="0" w:type="auto"/>
+            <w:vAlign w:val="center"/>
+            <w:hideMark/>
+          </w:tcPr>
+          <w:p>
+            <w:r>
+              <w:lastRenderedPageBreak/>
+              <w:t>Valid traffic</w:t>
+            </w:r>
+          </w:p>
+        </w:tc>
+        <w:tc>
+          <w:tcPr>
+            <w:tcW w:w="0" w:type="auto"/>
+            <w:vAlign w:val="center"/>
+            <w:hideMark/>
+          </w:tcPr>
+          <w:p>
+            <w:r>
+              <w:t>10000 bytes, 200 packets</w:t>
+            </w:r>
+          </w:p>
+        </w:tc>
+        <w:tc>
+          <w:tcPr>
+            <w:tcW w:w="0" w:type="auto"/>
+            <w:vAlign w:val="center"/>
+            <w:hideMark/>
+          </w:tcPr>
+          <w:p>
+            <w:r>
+              <w:t>Threat Detected</w:t>
+            </w:r>
+          </w:p>
+        </w:tc>
+        <w:tc>
+          <w:tcPr>
+            <w:tcW w:w="0" w:type="auto"/>
+            <w:vAlign w:val="center"/>
+            <w:hideMark/>
+          </w:tcPr>
+          <w:p>
+            <w:r>
+              <w:t>Pass</w:t>
+            </w:r>
+          </w:p>
+        </w:tc>
+      </w:tr>
+      <w:tr>
+        <w:trPr>
+          <w:tblCellSpacing w:w="15" w:type="dxa"/>
+        </w:trPr>
+        <w:tc>
+          <w:tcPr>
+            <w:tcW w:w="0" w:type="auto"/>
+            <w:vAlign w:val="center"/>
+            <w:hideMark/>
+          </w:tcPr>
+          <w:p>
+            <w:r>
+              <w:t>Empty input</w:t>
+            </w:r>
+          </w:p>
+        </w:tc>
+        <w:tc>
+          <w:tcPr>
+            <w:tcW w:w="0" w:type="auto"/>
+            <w:vAlign w:val="center"/>
+            <w:hideMark/>
+          </w:tcPr>
+          <w:p>
+            <w:r>
+              <w:t>Bytes empty, Packets 10</w:t>
+            </w:r>
+          </w:p>
+        </w:tc>
+        <w:tc>
+          <w:tcPr>
+            <w:tcW w:w="0" w:type="auto"/>
+            <w:vAlign w:val="center"/>
+            <w:hideMark/>
+          </w:tcPr>
+          <w:p>
+            <w:r>
+              <w:t>Input rejected</w:t>
+            </w:r>
+          </w:p>
+        </w:tc>
+        <w:tc>
+          <w:tcPr>
+            <w:tcW w:w="0" w:type="auto"/>
+            <w:vAlign w:val="center"/>
+            <w:hideMark/>
+          </w:tcPr>
+          <w:p>
+            <w:r>
+              <w:t>Pass</w:t>
+            </w:r>
+          </w:p>
+        </w:tc>
+      </w:tr>
+      <w:tr>
+        <w:trPr>
+          <w:tblCellSpacing w:w="15" w:type="dxa"/>
+        </w:trPr>
+        <w:tc>
+          <w:tcPr>
+            <w:tcW w:w="0" w:type="auto"/>
+            <w:vAlign w:val="center"/>
+            <w:hideMark/>
+          </w:tcPr>
+          <w:p>
+            <w:r>
+              <w:t>Repeated input</w:t>
+            </w:r>
+          </w:p>
+        </w:tc>
+        <w:tc>
+          <w:tcPr>
+            <w:tcW w:w="0" w:type="auto"/>
+            <w:vAlign w:val="center"/>
+            <w:hideMark/>
+          </w:tcPr>
+          <w:p>
+            <w:r>
+              <w:t>5000 bytes, 100 packets</w:t>
+            </w:r>
+          </w:p>
+        </w:tc>
+        <w:tc>
+          <w:tcPr>
+            <w:tcW w:w="0" w:type="auto"/>
+            <w:vAlign w:val="center"/>
+            <w:hideMark/>
+          </w:tcPr>
+          <w:p>
+            <w:r>
+              <w:t>Threat Detected</w:t>
+            </w:r>
+          </w:p>
+        </w:tc>
+        <w:tc>
+          <w:tcPr>
+            <w:tcW w:w="0" w:type="auto"/>
+            <w:vAlign w:val="center"/>
+            <w:hideMark/>
+          </w:tcPr>
+          <w:p>
+            <w:r>
+              <w:t>Pass</w:t>
+            </w:r>
+          </w:p>
+        </w:tc>
+      </w:tr>
+    </w:tbl>
+    <w:p>
+      <w:pPr>
+        <w:rPr>
+          <w:b/>
+          <w:bCs/>
+        </w:rPr>
+      </w:pPr>
+      <w:r>
+        <w:rPr>
+          <w:b/>
+          <w:bCs/>
+        </w:rPr>
+        <w:t>11.9 Integration Issue and Fix</w:t>
+      </w:r>
+    </w:p>
+    <w:p>
+      <w:r>
+        <w:t>During testing, an issue was identified in the dashboard where an empty input field could be converted to 0 before being sent to the API.</w:t>
+      </w:r>
+    </w:p>
+    <w:p>
+      <w:r>
+        <w:t>The issue was fixed by adding frontend validation to check whether both bytes and packets were entered before sending the request.</w:t>
+      </w:r>
+    </w:p>
+    <w:p>
+      <w:r>
+        <w:t>After the fix, empty input correctly displays:</w:t>
+      </w:r>
+    </w:p>
+    <w:p>
+      <w:r>
+        <w:rPr>
+          <w:b/>
+          <w:bCs/>
+        </w:rPr>
+        <w:t>“Please enter both bytes and packets.”</w:t>
+      </w:r>
+    </w:p>
+    <w:p>
+      <w:r>
+        <w:t>The system was then retested with valid inputs and successfully returned the detection result.</w:t>
+      </w:r>
+    </w:p>
+    <w:p>
+      <w:pPr>
+        <w:rPr>
+          <w:b/>
+          <w:bCs/>
+        </w:rPr>
+      </w:pPr>
+      <w:r>
+        <w:rPr>
+          <w:b/>
+          <w:bCs/>
+        </w:rPr>
+        <w:t>11.10 Performance Optimization</w:t>
+      </w:r>
+    </w:p>
+    <w:p>
+      <w:r>
+        <w:t>The backend contains a prediction caching mechanism. Previously generated predictions are stored for identical bytes and packets combinations. When the same input is received again, the cached result can be used instead of unnecessarily processing the same prediction again.</w:t>
+      </w:r>
+    </w:p>
+    <w:p>
+      <w:pPr>
+        <w:rPr>
+          <w:b/>
+          <w:bCs/>
+        </w:rPr>
+      </w:pPr>
+      <w:r>
+        <w:rPr>
+          <w:b/>
+          <w:bCs/>
+        </w:rPr>
+        <w:t>11.11 Final Integration Result</w:t>
+      </w:r>
+    </w:p>
+    <w:p>
+      <w:r>
+        <w:t>The Dashboard, Flask API, Random Forest model, input validation, and deployed backend were successfully tested together. The identified dashboard validation issue was fixed and the system was retested successfully.</w:t>
+      </w:r>
+    </w:p>
+    <w:p/>
+    <w:p>
       <w:r>
         <w:pict w14:anchorId="0789B2FB">
           <v:rect id="_x0000_i1157" style="width:0;height:1.5pt" o:hralign="center" o:hrstd="t" o:hr="t" fillcolor="#a0a0a0" stroked="f"/>
@@ -3740,6 +4317,221 @@
       </w:r>
     </w:p>
     <w:p>
+      <w:pPr>
+        <w:rPr>
+          <w:b/>
+          <w:bCs/>
+        </w:rPr>
+      </w:pPr>
+      <w:r>
+        <w:rPr>
+          <w:b/>
+          <w:bCs/>
+        </w:rPr>
+        <w:t>12.1 System Performance and Accuracy</w:t>
+      </w:r>
+    </w:p>
+    <w:p>
+      <w:r>
+        <w:t>The performance of the Automated Threat Detection System was evaluated using Accuracy, Precision, Recall, and ROC-AUC metrics.</w:t>
+      </w:r>
+    </w:p>
+    <w:tbl>
+      <w:tblPr>
+        <w:tblW w:w="0" w:type="auto"/>
+        <w:tblCellSpacing w:w="15" w:type="dxa"/>
+        <w:tblCellMar>
+          <w:top w:w="15" w:type="dxa"/>
+          <w:left w:w="15" w:type="dxa"/>
+          <w:bottom w:w="15" w:type="dxa"/>
+          <w:right w:w="15" w:type="dxa"/>
+        </w:tblCellMar>
+        <w:tblLook w:val="04A0" w:firstRow="1" w:lastRow="0" w:firstColumn="1" w:lastColumn="0" w:noHBand="0" w:noVBand="1"/>
+      </w:tblPr>
+      <w:tblGrid>
+        <w:gridCol w:w="2240"/>
+        <w:gridCol w:w="1791"/>
+      </w:tblGrid>
+      <w:tr>
+        <w:trPr>
+          <w:tblHeader/>
+          <w:tblCellSpacing w:w="15" w:type="dxa"/>
+        </w:trPr>
+        <w:tc>
+          <w:tcPr>
+            <w:tcW w:w="0" w:type="auto"/>
+            <w:vAlign w:val="center"/>
+            <w:hideMark/>
+          </w:tcPr>
+          <w:p>
+            <w:pPr>
+              <w:rPr>
+                <w:b/>
+                <w:bCs/>
+              </w:rPr>
+            </w:pPr>
+            <w:r>
+              <w:rPr>
+                <w:b/>
+                <w:bCs/>
+              </w:rPr>
+              <w:lastRenderedPageBreak/>
+              <w:t>Performance Metric</w:t>
+            </w:r>
+          </w:p>
+        </w:tc>
+        <w:tc>
+          <w:tcPr>
+            <w:tcW w:w="0" w:type="auto"/>
+            <w:vAlign w:val="center"/>
+            <w:hideMark/>
+          </w:tcPr>
+          <w:p>
+            <w:pPr>
+              <w:rPr>
+                <w:b/>
+                <w:bCs/>
+              </w:rPr>
+            </w:pPr>
+            <w:r>
+              <w:rPr>
+                <w:b/>
+                <w:bCs/>
+              </w:rPr>
+              <w:t>Recorded Value</w:t>
+            </w:r>
+          </w:p>
+        </w:tc>
+      </w:tr>
+      <w:tr>
+        <w:trPr>
+          <w:tblCellSpacing w:w="15" w:type="dxa"/>
+        </w:trPr>
+        <w:tc>
+          <w:tcPr>
+            <w:tcW w:w="0" w:type="auto"/>
+            <w:vAlign w:val="center"/>
+            <w:hideMark/>
+          </w:tcPr>
+          <w:p>
+            <w:r>
+              <w:t>Accuracy</w:t>
+            </w:r>
+          </w:p>
+        </w:tc>
+        <w:tc>
+          <w:tcPr>
+            <w:tcW w:w="0" w:type="auto"/>
+            <w:vAlign w:val="center"/>
+            <w:hideMark/>
+          </w:tcPr>
+          <w:p>
+            <w:r>
+              <w:t>100%</w:t>
+            </w:r>
+          </w:p>
+        </w:tc>
+      </w:tr>
+      <w:tr>
+        <w:trPr>
+          <w:tblCellSpacing w:w="15" w:type="dxa"/>
+        </w:trPr>
+        <w:tc>
+          <w:tcPr>
+            <w:tcW w:w="0" w:type="auto"/>
+            <w:vAlign w:val="center"/>
+            <w:hideMark/>
+          </w:tcPr>
+          <w:p>
+            <w:r>
+              <w:t>Precision</w:t>
+            </w:r>
+          </w:p>
+        </w:tc>
+        <w:tc>
+          <w:tcPr>
+            <w:tcW w:w="0" w:type="auto"/>
+            <w:vAlign w:val="center"/>
+            <w:hideMark/>
+          </w:tcPr>
+          <w:p>
+            <w:r>
+              <w:t>100%</w:t>
+            </w:r>
+          </w:p>
+        </w:tc>
+      </w:tr>
+      <w:tr>
+        <w:trPr>
+          <w:tblCellSpacing w:w="15" w:type="dxa"/>
+        </w:trPr>
+        <w:tc>
+          <w:tcPr>
+            <w:tcW w:w="0" w:type="auto"/>
+            <w:vAlign w:val="center"/>
+            <w:hideMark/>
+          </w:tcPr>
+          <w:p>
+            <w:r>
+              <w:t>Recall</w:t>
+            </w:r>
+          </w:p>
+        </w:tc>
+        <w:tc>
+          <w:tcPr>
+            <w:tcW w:w="0" w:type="auto"/>
+            <w:vAlign w:val="center"/>
+            <w:hideMark/>
+          </w:tcPr>
+          <w:p>
+            <w:r>
+              <w:t>100%</w:t>
+            </w:r>
+          </w:p>
+        </w:tc>
+      </w:tr>
+      <w:tr>
+        <w:trPr>
+          <w:tblCellSpacing w:w="15" w:type="dxa"/>
+        </w:trPr>
+        <w:tc>
+          <w:tcPr>
+            <w:tcW w:w="0" w:type="auto"/>
+            <w:vAlign w:val="center"/>
+            <w:hideMark/>
+          </w:tcPr>
+          <w:p>
+            <w:r>
+              <w:t>ROC-AUC</w:t>
+            </w:r>
+          </w:p>
+        </w:tc>
+        <w:tc>
+          <w:tcPr>
+            <w:tcW w:w="0" w:type="auto"/>
+            <w:vAlign w:val="center"/>
+            <w:hideMark/>
+          </w:tcPr>
+          <w:p>
+            <w:r>
+              <w:t>100%</w:t>
+            </w:r>
+          </w:p>
+        </w:tc>
+      </w:tr>
+    </w:tbl>
+    <w:p>
+      <w:r>
+        <w:t>The recorded evaluation results show that the trained model correctly classified the samples used during testing. The model achieved an Accuracy, Precision, Recall, and ROC-AUC value of 1.0.</w:t>
+      </w:r>
+    </w:p>
+    <w:p>
+      <w:r>
+        <w:t>These results represent the evaluation performed on the available test data. Further testing with larger and more diverse real-world network traffic datasets would be required to assess the model's performance in practical deployment conditions.</w:t>
+      </w:r>
+    </w:p>
+    <w:p/>
+    <w:p>
       <w:r>
         <w:t>The major results include:</w:t>
       </w:r>
@@ -3845,7 +4637,6 @@
     </w:p>
     <w:p>
       <w:r>
-        <w:lastRenderedPageBreak/>
         <w:t>The dashboard allows the user to enter network traffic information and receive a classification result.</w:t>
       </w:r>
     </w:p>
@@ -3937,7 +4728,21 @@
           <w:b/>
           <w:bCs/>
         </w:rPr>
-        <w:t>12.1 Discussion</w:t>
+        <w:t>12.</w:t>
+      </w:r>
+      <w:r>
+        <w:rPr>
+          <w:b/>
+          <w:bCs/>
+        </w:rPr>
+        <w:t>2</w:t>
+      </w:r>
+      <w:r>
+        <w:rPr>
+          <w:b/>
+          <w:bCs/>
+        </w:rPr>
+        <w:t xml:space="preserve"> Discussion</w:t>
       </w:r>
     </w:p>
     <w:p>
@@ -3956,8 +4761,150 @@
       </w:r>
     </w:p>
     <w:p>
+      <w:pPr>
+        <w:rPr>
+          <w:b/>
+          <w:bCs/>
+        </w:rPr>
+      </w:pPr>
+      <w:r>
+        <w:rPr>
+          <w:b/>
+          <w:bCs/>
+        </w:rPr>
+        <w:t>12.3 AI Model Training and Testing Process</w:t>
+      </w:r>
+    </w:p>
+    <w:p>
+      <w:r>
+        <w:t xml:space="preserve">The Automated Threat Detection System uses a </w:t>
+      </w:r>
+      <w:r>
+        <w:rPr>
+          <w:b/>
+          <w:bCs/>
+        </w:rPr>
+        <w:t>Random Forest Classifier</w:t>
+      </w:r>
+      <w:r>
+        <w:t xml:space="preserve"> for network threat classification. The model uses </w:t>
+      </w:r>
+      <w:r>
+        <w:rPr>
+          <w:b/>
+          <w:bCs/>
+        </w:rPr>
+        <w:t>bytes</w:t>
+      </w:r>
+      <w:r>
+        <w:t xml:space="preserve"> and </w:t>
+      </w:r>
+      <w:r>
+        <w:rPr>
+          <w:b/>
+          <w:bCs/>
+        </w:rPr>
+        <w:t>packets</w:t>
+      </w:r>
+      <w:r>
+        <w:t xml:space="preserve"> as input features.</w:t>
+      </w:r>
+    </w:p>
+    <w:p>
+      <w:r>
+        <w:t>The model training process involved preparing the network traffic dataset, selecting the required features, assigning the appropriate labels, and training the Random Forest classifier using the prepared data.</w:t>
+      </w:r>
+    </w:p>
+    <w:p>
       <w:r>
         <w:lastRenderedPageBreak/>
+        <w:t xml:space="preserve">After training, the model was evaluated using test data. The evaluation was performed using </w:t>
+      </w:r>
+      <w:r>
+        <w:rPr>
+          <w:b/>
+          <w:bCs/>
+        </w:rPr>
+        <w:t>Accuracy, Precision, Recall, and ROC-AUC</w:t>
+      </w:r>
+      <w:r>
+        <w:t xml:space="preserve"> metrics. The recorded values for all four metrics were </w:t>
+      </w:r>
+      <w:r>
+        <w:rPr>
+          <w:b/>
+          <w:bCs/>
+        </w:rPr>
+        <w:t>1.0 (100%)</w:t>
+      </w:r>
+      <w:r>
+        <w:t xml:space="preserve"> on the available test data.</w:t>
+      </w:r>
+    </w:p>
+    <w:p>
+      <w:r>
+        <w:t xml:space="preserve">The trained model was saved as a </w:t>
+      </w:r>
+      <w:r>
+        <w:rPr>
+          <w:b/>
+          <w:bCs/>
+        </w:rPr>
+        <w:t>.</w:t>
+      </w:r>
+      <w:proofErr w:type="spellStart"/>
+      <w:r>
+        <w:rPr>
+          <w:b/>
+          <w:bCs/>
+        </w:rPr>
+        <w:t>pkl</w:t>
+      </w:r>
+      <w:proofErr w:type="spellEnd"/>
+      <w:r>
+        <w:rPr>
+          <w:b/>
+          <w:bCs/>
+        </w:rPr>
+        <w:t xml:space="preserve"> file</w:t>
+      </w:r>
+      <w:r>
+        <w:t xml:space="preserve"> and integrated with the Flask backend. During system testing, sample values for bytes and packets were provided through the dashboard. The Flask API sent these values to the trained model, which returned either </w:t>
+      </w:r>
+      <w:r>
+        <w:rPr>
+          <w:b/>
+          <w:bCs/>
+        </w:rPr>
+        <w:t>Normal Activity</w:t>
+      </w:r>
+      <w:r>
+        <w:t xml:space="preserve"> or </w:t>
+      </w:r>
+      <w:r>
+        <w:rPr>
+          <w:b/>
+          <w:bCs/>
+        </w:rPr>
+        <w:t>Threat Detected</w:t>
+      </w:r>
+      <w:r>
+        <w:t>.</w:t>
+      </w:r>
+    </w:p>
+    <w:p>
+      <w:r>
+        <w:t>The testing process also included different valid traffic inputs, repeated inputs, and invalid input validation. This confirmed that the trained model could be integrated with the application and used for automated classification.</w:t>
+      </w:r>
+    </w:p>
+    <w:p>
+      <w:r>
+        <w:t>The current evaluation results are based on the available test data. Testing with larger and more diverse real-world network traffic datasets would be required for further evaluation of the model's practical performance.</w:t>
+      </w:r>
+    </w:p>
+    <w:p/>
+    <w:p>
+      <w:r>
         <w:pict w14:anchorId="48A403A7">
           <v:rect id="_x0000_i1158" style="width:0;height:1.5pt" o:hralign="center" o:hrstd="t" o:hr="t" fillcolor="#a0a0a0" stroked="f"/>
         </w:pict>
@@ -4104,6 +5051,7 @@
           <w:b/>
           <w:bCs/>
         </w:rPr>
+        <w:lastRenderedPageBreak/>
         <w:t>Input Validation</w:t>
       </w:r>
     </w:p>
@@ -4189,7 +5137,6 @@
     </w:p>
     <w:p>
       <w:r>
-        <w:lastRenderedPageBreak/>
         <w:t>One of the major lessons learned was that the quality, size, and realism of the training dataset strongly affect the usefulness of a Machine Learning system.</w:t>
       </w:r>
     </w:p>
@@ -4348,6 +5295,7 @@
         </w:numPr>
       </w:pPr>
       <w:r>
+        <w:lastRenderedPageBreak/>
         <w:t>Accuracy</w:t>
       </w:r>
     </w:p>
@@ -4437,191 +5385,191 @@
     </w:p>
     <w:p>
       <w:r>
+        <w:t>A managed cloud database can replace or supplement SQLite for production environments where persistent storage is required.</w:t>
+      </w:r>
+    </w:p>
+    <w:p>
+      <w:pPr>
+        <w:rPr>
+          <w:b/>
+          <w:bCs/>
+        </w:rPr>
+      </w:pPr>
+      <w:r>
+        <w:rPr>
+          <w:b/>
+          <w:bCs/>
+        </w:rPr>
+        <w:t>14.6 Improved Dashboard</w:t>
+      </w:r>
+    </w:p>
+    <w:p>
+      <w:r>
+        <w:t>The dashboard can be enhanced with:</w:t>
+      </w:r>
+    </w:p>
+    <w:p>
+      <w:pPr>
+        <w:numPr>
+          <w:ilvl w:val="0"/>
+          <w:numId w:val="20"/>
+        </w:numPr>
+      </w:pPr>
+      <w:r>
+        <w:t>Graphs</w:t>
+      </w:r>
+    </w:p>
+    <w:p>
+      <w:pPr>
+        <w:numPr>
+          <w:ilvl w:val="0"/>
+          <w:numId w:val="20"/>
+        </w:numPr>
+      </w:pPr>
+      <w:r>
+        <w:t>Threat statistics</w:t>
+      </w:r>
+    </w:p>
+    <w:p>
+      <w:pPr>
+        <w:numPr>
+          <w:ilvl w:val="0"/>
+          <w:numId w:val="20"/>
+        </w:numPr>
+      </w:pPr>
+      <w:r>
+        <w:t>Historical detection records</w:t>
+      </w:r>
+    </w:p>
+    <w:p>
+      <w:pPr>
+        <w:numPr>
+          <w:ilvl w:val="0"/>
+          <w:numId w:val="20"/>
+        </w:numPr>
+      </w:pPr>
+      <w:r>
+        <w:t>Traffic trends</w:t>
+      </w:r>
+    </w:p>
+    <w:p>
+      <w:pPr>
+        <w:numPr>
+          <w:ilvl w:val="0"/>
+          <w:numId w:val="20"/>
+        </w:numPr>
+      </w:pPr>
+      <w:r>
+        <w:t>Detection summaries</w:t>
+      </w:r>
+    </w:p>
+    <w:p>
+      <w:pPr>
+        <w:numPr>
+          <w:ilvl w:val="0"/>
+          <w:numId w:val="20"/>
+        </w:numPr>
+      </w:pPr>
+      <w:r>
+        <w:t>Alerts</w:t>
+      </w:r>
+    </w:p>
+    <w:p>
+      <w:pPr>
+        <w:rPr>
+          <w:b/>
+          <w:bCs/>
+        </w:rPr>
+      </w:pPr>
+      <w:r>
+        <w:rPr>
+          <w:b/>
+          <w:bCs/>
+        </w:rPr>
+        <w:t>14.7 Detailed Threat Classification</w:t>
+      </w:r>
+    </w:p>
+    <w:p>
+      <w:r>
+        <w:t>Instead of only:</w:t>
+      </w:r>
+    </w:p>
+    <w:p>
+      <w:r>
+        <w:rPr>
+          <w:b/>
+          <w:bCs/>
+        </w:rPr>
+        <w:t>Normal / Threat</w:t>
+      </w:r>
+    </w:p>
+    <w:p>
+      <w:r>
+        <w:t>future versions could identify different categories of network attacks.</w:t>
+      </w:r>
+    </w:p>
+    <w:p>
+      <w:pPr>
+        <w:rPr>
+          <w:b/>
+          <w:bCs/>
+        </w:rPr>
+      </w:pPr>
+      <w:r>
+        <w:rPr>
+          <w:b/>
+          <w:bCs/>
+        </w:rPr>
+        <w:t>14.8 Advanced Threat Detection</w:t>
+      </w:r>
+    </w:p>
+    <w:p>
+      <w:r>
+        <w:t>Future versions can explore:</w:t>
+      </w:r>
+    </w:p>
+    <w:p>
+      <w:pPr>
+        <w:numPr>
+          <w:ilvl w:val="0"/>
+          <w:numId w:val="21"/>
+        </w:numPr>
+      </w:pPr>
+      <w:r>
+        <w:t>Anomaly detection</w:t>
+      </w:r>
+    </w:p>
+    <w:p>
+      <w:pPr>
+        <w:numPr>
+          <w:ilvl w:val="0"/>
+          <w:numId w:val="21"/>
+        </w:numPr>
+      </w:pPr>
+      <w:r>
+        <w:t>Deep Learning</w:t>
+      </w:r>
+    </w:p>
+    <w:p>
+      <w:pPr>
+        <w:numPr>
+          <w:ilvl w:val="0"/>
+          <w:numId w:val="21"/>
+        </w:numPr>
+      </w:pPr>
+      <w:r>
+        <w:t>Ensemble techniques</w:t>
+      </w:r>
+    </w:p>
+    <w:p>
+      <w:pPr>
+        <w:numPr>
+          <w:ilvl w:val="0"/>
+          <w:numId w:val="21"/>
+        </w:numPr>
+      </w:pPr>
+      <w:r>
         <w:lastRenderedPageBreak/>
-        <w:t>A managed cloud database can replace or supplement SQLite for production environments where persistent storage is required.</w:t>
-      </w:r>
-    </w:p>
-    <w:p>
-      <w:pPr>
-        <w:rPr>
-          <w:b/>
-          <w:bCs/>
-        </w:rPr>
-      </w:pPr>
-      <w:r>
-        <w:rPr>
-          <w:b/>
-          <w:bCs/>
-        </w:rPr>
-        <w:t>14.6 Improved Dashboard</w:t>
-      </w:r>
-    </w:p>
-    <w:p>
-      <w:r>
-        <w:t>The dashboard can be enhanced with:</w:t>
-      </w:r>
-    </w:p>
-    <w:p>
-      <w:pPr>
-        <w:numPr>
-          <w:ilvl w:val="0"/>
-          <w:numId w:val="20"/>
-        </w:numPr>
-      </w:pPr>
-      <w:r>
-        <w:t>Graphs</w:t>
-      </w:r>
-    </w:p>
-    <w:p>
-      <w:pPr>
-        <w:numPr>
-          <w:ilvl w:val="0"/>
-          <w:numId w:val="20"/>
-        </w:numPr>
-      </w:pPr>
-      <w:r>
-        <w:t>Threat statistics</w:t>
-      </w:r>
-    </w:p>
-    <w:p>
-      <w:pPr>
-        <w:numPr>
-          <w:ilvl w:val="0"/>
-          <w:numId w:val="20"/>
-        </w:numPr>
-      </w:pPr>
-      <w:r>
-        <w:t>Historical detection records</w:t>
-      </w:r>
-    </w:p>
-    <w:p>
-      <w:pPr>
-        <w:numPr>
-          <w:ilvl w:val="0"/>
-          <w:numId w:val="20"/>
-        </w:numPr>
-      </w:pPr>
-      <w:r>
-        <w:t>Traffic trends</w:t>
-      </w:r>
-    </w:p>
-    <w:p>
-      <w:pPr>
-        <w:numPr>
-          <w:ilvl w:val="0"/>
-          <w:numId w:val="20"/>
-        </w:numPr>
-      </w:pPr>
-      <w:r>
-        <w:t>Detection summaries</w:t>
-      </w:r>
-    </w:p>
-    <w:p>
-      <w:pPr>
-        <w:numPr>
-          <w:ilvl w:val="0"/>
-          <w:numId w:val="20"/>
-        </w:numPr>
-      </w:pPr>
-      <w:r>
-        <w:t>Alerts</w:t>
-      </w:r>
-    </w:p>
-    <w:p>
-      <w:pPr>
-        <w:rPr>
-          <w:b/>
-          <w:bCs/>
-        </w:rPr>
-      </w:pPr>
-      <w:r>
-        <w:rPr>
-          <w:b/>
-          <w:bCs/>
-        </w:rPr>
-        <w:t>14.7 Detailed Threat Classification</w:t>
-      </w:r>
-    </w:p>
-    <w:p>
-      <w:r>
-        <w:t>Instead of only:</w:t>
-      </w:r>
-    </w:p>
-    <w:p>
-      <w:r>
-        <w:rPr>
-          <w:b/>
-          <w:bCs/>
-        </w:rPr>
-        <w:t>Normal / Threat</w:t>
-      </w:r>
-    </w:p>
-    <w:p>
-      <w:r>
-        <w:t>future versions could identify different categories of network attacks.</w:t>
-      </w:r>
-    </w:p>
-    <w:p>
-      <w:pPr>
-        <w:rPr>
-          <w:b/>
-          <w:bCs/>
-        </w:rPr>
-      </w:pPr>
-      <w:r>
-        <w:rPr>
-          <w:b/>
-          <w:bCs/>
-        </w:rPr>
-        <w:t>14.8 Advanced Threat Detection</w:t>
-      </w:r>
-    </w:p>
-    <w:p>
-      <w:r>
-        <w:t>Future versions can explore:</w:t>
-      </w:r>
-    </w:p>
-    <w:p>
-      <w:pPr>
-        <w:numPr>
-          <w:ilvl w:val="0"/>
-          <w:numId w:val="21"/>
-        </w:numPr>
-      </w:pPr>
-      <w:r>
-        <w:t>Anomaly detection</w:t>
-      </w:r>
-    </w:p>
-    <w:p>
-      <w:pPr>
-        <w:numPr>
-          <w:ilvl w:val="0"/>
-          <w:numId w:val="21"/>
-        </w:numPr>
-      </w:pPr>
-      <w:r>
-        <w:t>Deep Learning</w:t>
-      </w:r>
-    </w:p>
-    <w:p>
-      <w:pPr>
-        <w:numPr>
-          <w:ilvl w:val="0"/>
-          <w:numId w:val="21"/>
-        </w:numPr>
-      </w:pPr>
-      <w:r>
-        <w:t>Ensemble techniques</w:t>
-      </w:r>
-    </w:p>
-    <w:p>
-      <w:pPr>
-        <w:numPr>
-          <w:ilvl w:val="0"/>
-          <w:numId w:val="21"/>
-        </w:numPr>
-      </w:pPr>
-      <w:r>
         <w:t>Continuous monitoring</w:t>
       </w:r>
     </w:p>
@@ -4695,151 +5643,151 @@
     </w:p>
     <w:p>
       <w:r>
+        <w:t>The project combines several important technologies and concepts, including:</w:t>
+      </w:r>
+    </w:p>
+    <w:p>
+      <w:pPr>
+        <w:numPr>
+          <w:ilvl w:val="0"/>
+          <w:numId w:val="22"/>
+        </w:numPr>
+      </w:pPr>
+      <w:r>
+        <w:t>Python</w:t>
+      </w:r>
+    </w:p>
+    <w:p>
+      <w:pPr>
+        <w:numPr>
+          <w:ilvl w:val="0"/>
+          <w:numId w:val="22"/>
+        </w:numPr>
+      </w:pPr>
+      <w:r>
+        <w:t>Pandas</w:t>
+      </w:r>
+    </w:p>
+    <w:p>
+      <w:pPr>
+        <w:numPr>
+          <w:ilvl w:val="0"/>
+          <w:numId w:val="22"/>
+        </w:numPr>
+      </w:pPr>
+      <w:r>
+        <w:t>Scikit-learn</w:t>
+      </w:r>
+    </w:p>
+    <w:p>
+      <w:pPr>
+        <w:numPr>
+          <w:ilvl w:val="0"/>
+          <w:numId w:val="22"/>
+        </w:numPr>
+      </w:pPr>
+      <w:r>
+        <w:t>Random Forest</w:t>
+      </w:r>
+    </w:p>
+    <w:p>
+      <w:pPr>
+        <w:numPr>
+          <w:ilvl w:val="0"/>
+          <w:numId w:val="22"/>
+        </w:numPr>
+      </w:pPr>
+      <w:r>
+        <w:t>Flask</w:t>
+      </w:r>
+    </w:p>
+    <w:p>
+      <w:pPr>
+        <w:numPr>
+          <w:ilvl w:val="0"/>
+          <w:numId w:val="22"/>
+        </w:numPr>
+      </w:pPr>
+      <w:r>
+        <w:t>SQLite</w:t>
+      </w:r>
+    </w:p>
+    <w:p>
+      <w:pPr>
+        <w:numPr>
+          <w:ilvl w:val="0"/>
+          <w:numId w:val="22"/>
+        </w:numPr>
+      </w:pPr>
+      <w:r>
+        <w:t>HTML/CSS/JavaScript</w:t>
+      </w:r>
+    </w:p>
+    <w:p>
+      <w:pPr>
+        <w:numPr>
+          <w:ilvl w:val="0"/>
+          <w:numId w:val="22"/>
+        </w:numPr>
+      </w:pPr>
+      <w:r>
+        <w:t>GitHub</w:t>
+      </w:r>
+    </w:p>
+    <w:p>
+      <w:pPr>
+        <w:numPr>
+          <w:ilvl w:val="0"/>
+          <w:numId w:val="22"/>
+        </w:numPr>
+      </w:pPr>
+      <w:r>
+        <w:t>Render</w:t>
+      </w:r>
+    </w:p>
+    <w:p>
+      <w:r>
+        <w:t xml:space="preserve">The system accepts network traffic information such as bytes and packets, processes the input, and uses a trained Random Forest model to classify the activity as </w:t>
+      </w:r>
+      <w:r>
+        <w:rPr>
+          <w:b/>
+          <w:bCs/>
+        </w:rPr>
+        <w:t>Normal Activity</w:t>
+      </w:r>
+      <w:r>
+        <w:t xml:space="preserve"> or </w:t>
+      </w:r>
+      <w:r>
+        <w:rPr>
+          <w:b/>
+          <w:bCs/>
+        </w:rPr>
+        <w:t>Threat Detected</w:t>
+      </w:r>
+      <w:r>
+        <w:t>.</w:t>
+      </w:r>
+    </w:p>
+    <w:p>
+      <w:r>
+        <w:t>The project also includes a dashboard, API, database logging, input validation, security testing, and cloud deployment.</w:t>
+      </w:r>
+    </w:p>
+    <w:p>
+      <w:r>
+        <w:t>Overall, the project provides a practical foundation for understanding how Machine Learning can be integrated into a security-oriented software application.</w:t>
+      </w:r>
+    </w:p>
+    <w:p>
+      <w:r>
+        <w:t>The current prototype has limitations because it uses a small/synthetic dataset and a limited number of features. Therefore, future development should focus on larger real-world datasets, stronger evaluation, additional network features, improved security, persistent storage, and more advanced threat detection methods.</w:t>
+      </w:r>
+    </w:p>
+    <w:p>
+      <w:r>
         <w:lastRenderedPageBreak/>
-        <w:t>The project combines several important technologies and concepts, including:</w:t>
-      </w:r>
-    </w:p>
-    <w:p>
-      <w:pPr>
-        <w:numPr>
-          <w:ilvl w:val="0"/>
-          <w:numId w:val="22"/>
-        </w:numPr>
-      </w:pPr>
-      <w:r>
-        <w:t>Python</w:t>
-      </w:r>
-    </w:p>
-    <w:p>
-      <w:pPr>
-        <w:numPr>
-          <w:ilvl w:val="0"/>
-          <w:numId w:val="22"/>
-        </w:numPr>
-      </w:pPr>
-      <w:r>
-        <w:t>Pandas</w:t>
-      </w:r>
-    </w:p>
-    <w:p>
-      <w:pPr>
-        <w:numPr>
-          <w:ilvl w:val="0"/>
-          <w:numId w:val="22"/>
-        </w:numPr>
-      </w:pPr>
-      <w:r>
-        <w:t>Scikit-learn</w:t>
-      </w:r>
-    </w:p>
-    <w:p>
-      <w:pPr>
-        <w:numPr>
-          <w:ilvl w:val="0"/>
-          <w:numId w:val="22"/>
-        </w:numPr>
-      </w:pPr>
-      <w:r>
-        <w:t>Random Forest</w:t>
-      </w:r>
-    </w:p>
-    <w:p>
-      <w:pPr>
-        <w:numPr>
-          <w:ilvl w:val="0"/>
-          <w:numId w:val="22"/>
-        </w:numPr>
-      </w:pPr>
-      <w:r>
-        <w:t>Flask</w:t>
-      </w:r>
-    </w:p>
-    <w:p>
-      <w:pPr>
-        <w:numPr>
-          <w:ilvl w:val="0"/>
-          <w:numId w:val="22"/>
-        </w:numPr>
-      </w:pPr>
-      <w:r>
-        <w:t>SQLite</w:t>
-      </w:r>
-    </w:p>
-    <w:p>
-      <w:pPr>
-        <w:numPr>
-          <w:ilvl w:val="0"/>
-          <w:numId w:val="22"/>
-        </w:numPr>
-      </w:pPr>
-      <w:r>
-        <w:t>HTML/CSS/JavaScript</w:t>
-      </w:r>
-    </w:p>
-    <w:p>
-      <w:pPr>
-        <w:numPr>
-          <w:ilvl w:val="0"/>
-          <w:numId w:val="22"/>
-        </w:numPr>
-      </w:pPr>
-      <w:r>
-        <w:t>GitHub</w:t>
-      </w:r>
-    </w:p>
-    <w:p>
-      <w:pPr>
-        <w:numPr>
-          <w:ilvl w:val="0"/>
-          <w:numId w:val="22"/>
-        </w:numPr>
-      </w:pPr>
-      <w:r>
-        <w:t>Render</w:t>
-      </w:r>
-    </w:p>
-    <w:p>
-      <w:r>
-        <w:t xml:space="preserve">The system accepts network traffic information such as bytes and packets, processes the input, and uses a trained Random Forest model to classify the activity as </w:t>
-      </w:r>
-      <w:r>
-        <w:rPr>
-          <w:b/>
-          <w:bCs/>
-        </w:rPr>
-        <w:t>Normal Activity</w:t>
-      </w:r>
-      <w:r>
-        <w:t xml:space="preserve"> or </w:t>
-      </w:r>
-      <w:r>
-        <w:rPr>
-          <w:b/>
-          <w:bCs/>
-        </w:rPr>
-        <w:t>Threat Detected</w:t>
-      </w:r>
-      <w:r>
-        <w:t>.</w:t>
-      </w:r>
-    </w:p>
-    <w:p>
-      <w:r>
-        <w:t>The project also includes a dashboard, API, database logging, input validation, security testing, and cloud deployment.</w:t>
-      </w:r>
-    </w:p>
-    <w:p>
-      <w:r>
-        <w:t>Overall, the project provides a practical foundation for understanding how Machine Learning can be integrated into a security-oriented software application.</w:t>
-      </w:r>
-    </w:p>
-    <w:p>
-      <w:r>
-        <w:t>The current prototype has limitations because it uses a small/synthetic dataset and a limited number of features. Therefore, future development should focus on larger real-world datasets, stronger evaluation, additional network features, improved security, persistent storage, and more advanced threat detection methods.</w:t>
-      </w:r>
-    </w:p>
-    <w:p>
-      <w:r>
         <w:pict w14:anchorId="6E45C13B">
           <v:rect id="_x0000_i1161" style="width:0;height:1.5pt" o:hralign="center" o:hrstd="t" o:hr="t" fillcolor="#a0a0a0" stroked="f"/>
         </w:pict>
@@ -4934,7 +5882,6 @@
         </w:numPr>
       </w:pPr>
       <w:r>
-        <w:lastRenderedPageBreak/>
         <w:t>Render Documentation — Cloud deployment and hosting documentation.</w:t>
       </w:r>
     </w:p>
@@ -5180,6 +6127,7 @@
     </w:p>
     <w:p>
       <w:r>
+        <w:lastRenderedPageBreak/>
         <w:t>Add your actual dashboard screenshot showing:</w:t>
       </w:r>
     </w:p>
@@ -5279,7 +6227,6 @@
           <w:b/>
           <w:bCs/>
         </w:rPr>
-        <w:lastRenderedPageBreak/>
         <w:t>Screenshot 4 — API Testing</w:t>
       </w:r>
     </w:p>
@@ -5383,6 +6330,7 @@
     </w:p>
     <w:p>
       <w:r>
+        <w:lastRenderedPageBreak/>
         <w:t xml:space="preserve">                                            ↓</w:t>
       </w:r>
     </w:p>

</xml_diff>

<commit_message>
Complete Week 8 review and documentation
</commit_message>
<xml_diff>
--- a/FINAL PROJECT REPORT.docx
+++ b/FINAL PROJECT REPORT.docx
@@ -59,6 +59,9 @@
         <w:t xml:space="preserve"> Shreya</w:t>
       </w:r>
       <w:r>
+        <w:t xml:space="preserve"> Sawant</w:t>
+      </w:r>
+      <w:r>
         <w:br/>
       </w:r>
       <w:r>
@@ -242,15 +245,7 @@
     </w:p>
     <w:p>
       <w:r>
-        <w:t xml:space="preserve">Monitoring large amounts of network traffic manually can be time-consuming and difficult. Automated threat detection can help by </w:t>
-      </w:r>
-      <w:proofErr w:type="spellStart"/>
-      <w:r>
-        <w:t>analyzing</w:t>
-      </w:r>
-      <w:proofErr w:type="spellEnd"/>
-      <w:r>
-        <w:t xml:space="preserve"> traffic using software and machine-learning techniques and providing a quick classification.</w:t>
+        <w:t>Monitoring large amounts of network traffic manually can be time-consuming and difficult. Automated threat detection can help by analyzing traffic using software and machine-learning techniques and providing a quick classification.</w:t>
       </w:r>
     </w:p>
     <w:p>
@@ -266,15 +261,7 @@
         <w:t>Automated Threat Detection System</w:t>
       </w:r>
       <w:r>
-        <w:t xml:space="preserve"> developed in this project uses Machine Learning to </w:t>
-      </w:r>
-      <w:proofErr w:type="spellStart"/>
-      <w:r>
-        <w:t>analyze</w:t>
-      </w:r>
-      <w:proofErr w:type="spellEnd"/>
-      <w:r>
-        <w:t xml:space="preserve"> network traffic and classify it into two categories:</w:t>
+        <w:t xml:space="preserve"> developed in this project uses Machine Learning to analyze network traffic and classify it into two categories:</w:t>
       </w:r>
     </w:p>
     <w:p>
@@ -370,15 +357,7 @@
     </w:p>
     <w:p>
       <w:r>
-        <w:t xml:space="preserve">Network threat detection is the process of monitoring network activity to identify suspicious or potentially harmful </w:t>
-      </w:r>
-      <w:proofErr w:type="spellStart"/>
-      <w:r>
-        <w:t>behavior</w:t>
-      </w:r>
-      <w:proofErr w:type="spellEnd"/>
-      <w:r>
-        <w:t>.</w:t>
+        <w:t>Network threat detection is the process of monitoring network activity to identify suspicious or potentially harmful behavior.</w:t>
       </w:r>
     </w:p>
     <w:p>
@@ -543,15 +522,7 @@
         </w:numPr>
       </w:pPr>
       <w:r>
-        <w:t xml:space="preserve">Large amounts of traffic can be difficult to </w:t>
-      </w:r>
-      <w:proofErr w:type="spellStart"/>
-      <w:r>
-        <w:t>analyze</w:t>
-      </w:r>
-      <w:proofErr w:type="spellEnd"/>
-      <w:r>
-        <w:t xml:space="preserve"> continuously.</w:t>
+        <w:t>Large amounts of traffic can be difficult to analyze continuously.</w:t>
       </w:r>
     </w:p>
     <w:p>
@@ -578,15 +549,7 @@
     </w:p>
     <w:p>
       <w:r>
-        <w:t xml:space="preserve">Therefore, this project aims to develop a basic automated system that uses Machine Learning to </w:t>
-      </w:r>
-      <w:proofErr w:type="spellStart"/>
-      <w:r>
-        <w:t>analyze</w:t>
-      </w:r>
-      <w:proofErr w:type="spellEnd"/>
-      <w:r>
-        <w:t xml:space="preserve"> network traffic and provide a quick classification result.</w:t>
+        <w:t>Therefore, this project aims to develop a basic automated system that uses Machine Learning to analyze network traffic and provide a quick classification result.</w:t>
       </w:r>
     </w:p>
     <w:p>
@@ -646,15 +609,7 @@
         </w:numPr>
       </w:pPr>
       <w:r>
-        <w:t xml:space="preserve">To </w:t>
-      </w:r>
-      <w:proofErr w:type="spellStart"/>
-      <w:r>
-        <w:t>analyze</w:t>
-      </w:r>
-      <w:proofErr w:type="spellEnd"/>
-      <w:r>
-        <w:t xml:space="preserve"> network traffic using bytes and packets.</w:t>
+        <w:t>To analyze network traffic using bytes and packets.</w:t>
       </w:r>
     </w:p>
     <w:p>
@@ -1457,7 +1412,6 @@
             <w:hideMark/>
           </w:tcPr>
           <w:p>
-            <w:proofErr w:type="spellStart"/>
             <w:r>
               <w:rPr>
                 <w:b/>
@@ -1465,7 +1419,6 @@
               </w:rPr>
               <w:t>Gunicorn</w:t>
             </w:r>
-            <w:proofErr w:type="spellEnd"/>
           </w:p>
         </w:tc>
         <w:tc>
@@ -1856,15 +1809,7 @@
     <w:p>
       <w:r>
         <w:lastRenderedPageBreak/>
-        <w:t xml:space="preserve">The trained Random Forest classifier </w:t>
-      </w:r>
-      <w:proofErr w:type="spellStart"/>
-      <w:r>
-        <w:t>analyzes</w:t>
-      </w:r>
-      <w:proofErr w:type="spellEnd"/>
-      <w:r>
-        <w:t xml:space="preserve"> the input features and generates a prediction.</w:t>
+        <w:t>The trained Random Forest classifier analyzes the input features and generates a prediction.</w:t>
       </w:r>
     </w:p>
     <w:p>
@@ -2510,23 +2455,7 @@
           <w:b/>
           <w:bCs/>
         </w:rPr>
-        <w:t>.</w:t>
-      </w:r>
-      <w:proofErr w:type="spellStart"/>
-      <w:r>
-        <w:rPr>
-          <w:b/>
-          <w:bCs/>
-        </w:rPr>
-        <w:t>pkl</w:t>
-      </w:r>
-      <w:proofErr w:type="spellEnd"/>
-      <w:r>
-        <w:rPr>
-          <w:b/>
-          <w:bCs/>
-        </w:rPr>
-        <w:t xml:space="preserve"> file</w:t>
+        <w:t>.pkl file</w:t>
       </w:r>
       <w:r>
         <w:t>.</w:t>
@@ -2774,15 +2703,7 @@
     </w:p>
     <w:p>
       <w:r>
-        <w:t xml:space="preserve">The Flask application can be deployed on Render using a production server such as </w:t>
-      </w:r>
-      <w:proofErr w:type="spellStart"/>
-      <w:r>
-        <w:t>Gunicorn</w:t>
-      </w:r>
-      <w:proofErr w:type="spellEnd"/>
-      <w:r>
-        <w:t>.</w:t>
+        <w:t>The Flask application can be deployed on Render using a production server such as Gunicorn.</w:t>
       </w:r>
     </w:p>
     <w:p>
@@ -2851,13 +2772,8 @@
     </w:p>
     <w:p>
       <w:r>
-        <w:t xml:space="preserve">Flask + </w:t>
-      </w:r>
-      <w:proofErr w:type="spellStart"/>
-      <w:r>
-        <w:t>Gunicorn</w:t>
-      </w:r>
-      <w:proofErr w:type="spellEnd"/>
+        <w:t>Flask + Gunicorn</w:t>
+      </w:r>
     </w:p>
     <w:p>
       <w:r>
@@ -3054,15 +2970,7 @@
     </w:p>
     <w:p>
       <w:r>
-        <w:t>After training, the model is saved as a .</w:t>
-      </w:r>
-      <w:proofErr w:type="spellStart"/>
-      <w:r>
-        <w:t>pkl</w:t>
-      </w:r>
-      <w:proofErr w:type="spellEnd"/>
-      <w:r>
-        <w:t xml:space="preserve"> file.</w:t>
+        <w:t>After training, the model is saved as a .pkl file.</w:t>
       </w:r>
     </w:p>
     <w:p>
@@ -4530,6 +4438,21 @@
         <w:t>These results represent the evaluation performed on the available test data. Further testing with larger and more diverse real-world network traffic datasets would be required to assess the model's performance in practical deployment conditions.</w:t>
       </w:r>
     </w:p>
+    <w:p>
+      <w:r>
+        <w:t xml:space="preserve">The Random Forest model was optimized by increasing the number of estimators from 50 to 100 and the maximum tree depth from 3 to 5. The optimized model achieved a test accuracy of </w:t>
+      </w:r>
+      <w:r>
+        <w:rPr>
+          <w:b/>
+          <w:bCs/>
+        </w:rPr>
+        <w:t>100%</w:t>
+      </w:r>
+      <w:r>
+        <w:t xml:space="preserve"> on the available test samples.</w:t>
+      </w:r>
+    </w:p>
     <w:p/>
     <w:p>
       <w:r>
@@ -4652,6 +4575,7 @@
     </w:p>
     <w:p>
       <w:r>
+        <w:lastRenderedPageBreak/>
         <w:t>Packets:   100</w:t>
       </w:r>
     </w:p>
@@ -4812,12 +4736,12 @@
     </w:p>
     <w:p>
       <w:r>
+        <w:lastRenderedPageBreak/>
         <w:t>The model training process involved preparing the network traffic dataset, selecting the required features, assigning the appropriate labels, and training the Random Forest classifier using the prepared data.</w:t>
       </w:r>
     </w:p>
     <w:p>
       <w:r>
-        <w:lastRenderedPageBreak/>
         <w:t xml:space="preserve">After training, the model was evaluated using test data. The evaluation was performed using </w:t>
       </w:r>
       <w:r>
@@ -4850,23 +4774,7 @@
           <w:b/>
           <w:bCs/>
         </w:rPr>
-        <w:t>.</w:t>
-      </w:r>
-      <w:proofErr w:type="spellStart"/>
-      <w:r>
-        <w:rPr>
-          <w:b/>
-          <w:bCs/>
-        </w:rPr>
-        <w:t>pkl</w:t>
-      </w:r>
-      <w:proofErr w:type="spellEnd"/>
-      <w:r>
-        <w:rPr>
-          <w:b/>
-          <w:bCs/>
-        </w:rPr>
-        <w:t xml:space="preserve"> file</w:t>
+        <w:t>.pkl file</w:t>
       </w:r>
       <w:r>
         <w:t xml:space="preserve"> and integrated with the Flask backend. During system testing, sample values for bytes and packets were provided through the dashboard. The Flask API sent these values to the trained model, which returned either </w:t>
@@ -5031,6 +4939,7 @@
           <w:b/>
           <w:bCs/>
         </w:rPr>
+        <w:lastRenderedPageBreak/>
         <w:t>Database Integration</w:t>
       </w:r>
     </w:p>
@@ -5051,7 +4960,6 @@
           <w:b/>
           <w:bCs/>
         </w:rPr>
-        <w:lastRenderedPageBreak/>
         <w:t>Input Validation</w:t>
       </w:r>
     </w:p>
@@ -5279,6 +5187,7 @@
           <w:b/>
           <w:bCs/>
         </w:rPr>
+        <w:lastRenderedPageBreak/>
         <w:t>14.3 Improved Model Evaluation</w:t>
       </w:r>
     </w:p>
@@ -5295,237 +5204,259 @@
         </w:numPr>
       </w:pPr>
       <w:r>
+        <w:t>Accuracy</w:t>
+      </w:r>
+    </w:p>
+    <w:p>
+      <w:pPr>
+        <w:numPr>
+          <w:ilvl w:val="0"/>
+          <w:numId w:val="19"/>
+        </w:numPr>
+      </w:pPr>
+      <w:r>
+        <w:t>Precision</w:t>
+      </w:r>
+    </w:p>
+    <w:p>
+      <w:pPr>
+        <w:numPr>
+          <w:ilvl w:val="0"/>
+          <w:numId w:val="19"/>
+        </w:numPr>
+      </w:pPr>
+      <w:r>
+        <w:t>Recall</w:t>
+      </w:r>
+    </w:p>
+    <w:p>
+      <w:pPr>
+        <w:numPr>
+          <w:ilvl w:val="0"/>
+          <w:numId w:val="19"/>
+        </w:numPr>
+      </w:pPr>
+      <w:r>
+        <w:t>F1-score</w:t>
+      </w:r>
+    </w:p>
+    <w:p>
+      <w:pPr>
+        <w:numPr>
+          <w:ilvl w:val="0"/>
+          <w:numId w:val="19"/>
+        </w:numPr>
+      </w:pPr>
+      <w:r>
+        <w:t>Confusion Matrix</w:t>
+      </w:r>
+    </w:p>
+    <w:p>
+      <w:r>
+        <w:t>Different models can also be compared to understand their performance on the same dataset.</w:t>
+      </w:r>
+    </w:p>
+    <w:p>
+      <w:pPr>
+        <w:rPr>
+          <w:b/>
+          <w:bCs/>
+        </w:rPr>
+      </w:pPr>
+      <w:r>
+        <w:rPr>
+          <w:b/>
+          <w:bCs/>
+        </w:rPr>
+        <w:t>14.4 Stronger Authentication</w:t>
+      </w:r>
+    </w:p>
+    <w:p>
+      <w:r>
+        <w:t>User authentication and authorization can be added to protect the dashboard and API.</w:t>
+      </w:r>
+    </w:p>
+    <w:p>
+      <w:pPr>
+        <w:rPr>
+          <w:b/>
+          <w:bCs/>
+        </w:rPr>
+      </w:pPr>
+      <w:r>
+        <w:rPr>
+          <w:b/>
+          <w:bCs/>
+        </w:rPr>
+        <w:t>14.5 Persistent Cloud Database</w:t>
+      </w:r>
+    </w:p>
+    <w:p>
+      <w:r>
+        <w:t>A managed cloud database can replace or supplement SQLite for production environments where persistent storage is required.</w:t>
+      </w:r>
+    </w:p>
+    <w:p>
+      <w:pPr>
+        <w:rPr>
+          <w:b/>
+          <w:bCs/>
+        </w:rPr>
+      </w:pPr>
+      <w:r>
+        <w:rPr>
+          <w:b/>
+          <w:bCs/>
+        </w:rPr>
+        <w:t>14.6 Improved Dashboard</w:t>
+      </w:r>
+    </w:p>
+    <w:p>
+      <w:r>
+        <w:t>The dashboard can be enhanced with:</w:t>
+      </w:r>
+    </w:p>
+    <w:p>
+      <w:pPr>
+        <w:numPr>
+          <w:ilvl w:val="0"/>
+          <w:numId w:val="20"/>
+        </w:numPr>
+      </w:pPr>
+      <w:r>
+        <w:t>Graphs</w:t>
+      </w:r>
+    </w:p>
+    <w:p>
+      <w:pPr>
+        <w:numPr>
+          <w:ilvl w:val="0"/>
+          <w:numId w:val="20"/>
+        </w:numPr>
+      </w:pPr>
+      <w:r>
+        <w:t>Threat statistics</w:t>
+      </w:r>
+    </w:p>
+    <w:p>
+      <w:pPr>
+        <w:numPr>
+          <w:ilvl w:val="0"/>
+          <w:numId w:val="20"/>
+        </w:numPr>
+      </w:pPr>
+      <w:r>
+        <w:t>Historical detection records</w:t>
+      </w:r>
+    </w:p>
+    <w:p>
+      <w:pPr>
+        <w:numPr>
+          <w:ilvl w:val="0"/>
+          <w:numId w:val="20"/>
+        </w:numPr>
+      </w:pPr>
+      <w:r>
+        <w:t>Traffic trends</w:t>
+      </w:r>
+    </w:p>
+    <w:p>
+      <w:pPr>
+        <w:numPr>
+          <w:ilvl w:val="0"/>
+          <w:numId w:val="20"/>
+        </w:numPr>
+      </w:pPr>
+      <w:r>
+        <w:t>Detection summaries</w:t>
+      </w:r>
+    </w:p>
+    <w:p>
+      <w:pPr>
+        <w:numPr>
+          <w:ilvl w:val="0"/>
+          <w:numId w:val="20"/>
+        </w:numPr>
+      </w:pPr>
+      <w:r>
+        <w:t>Alerts</w:t>
+      </w:r>
+    </w:p>
+    <w:p>
+      <w:pPr>
+        <w:rPr>
+          <w:b/>
+          <w:bCs/>
+        </w:rPr>
+      </w:pPr>
+      <w:r>
+        <w:rPr>
+          <w:b/>
+          <w:bCs/>
+        </w:rPr>
+        <w:t>14.7 Detailed Threat Classification</w:t>
+      </w:r>
+    </w:p>
+    <w:p>
+      <w:r>
+        <w:t>Instead of only:</w:t>
+      </w:r>
+    </w:p>
+    <w:p>
+      <w:r>
+        <w:rPr>
+          <w:b/>
+          <w:bCs/>
+        </w:rPr>
+        <w:t>Normal / Threat</w:t>
+      </w:r>
+    </w:p>
+    <w:p>
+      <w:r>
+        <w:t>future versions could identify different categories of network attacks.</w:t>
+      </w:r>
+    </w:p>
+    <w:p>
+      <w:pPr>
+        <w:rPr>
+          <w:b/>
+          <w:bCs/>
+        </w:rPr>
+      </w:pPr>
+      <w:r>
+        <w:rPr>
+          <w:b/>
+          <w:bCs/>
+        </w:rPr>
+        <w:t>14.8 Advanced Threat Detection</w:t>
+      </w:r>
+    </w:p>
+    <w:p>
+      <w:r>
+        <w:t>Future versions can explore:</w:t>
+      </w:r>
+    </w:p>
+    <w:p>
+      <w:pPr>
+        <w:numPr>
+          <w:ilvl w:val="0"/>
+          <w:numId w:val="21"/>
+        </w:numPr>
+      </w:pPr>
+      <w:r>
+        <w:t>Anomaly detection</w:t>
+      </w:r>
+    </w:p>
+    <w:p>
+      <w:pPr>
+        <w:numPr>
+          <w:ilvl w:val="0"/>
+          <w:numId w:val="21"/>
+        </w:numPr>
+      </w:pPr>
+      <w:r>
         <w:lastRenderedPageBreak/>
-        <w:t>Accuracy</w:t>
-      </w:r>
-    </w:p>
-    <w:p>
-      <w:pPr>
-        <w:numPr>
-          <w:ilvl w:val="0"/>
-          <w:numId w:val="19"/>
-        </w:numPr>
-      </w:pPr>
-      <w:r>
-        <w:t>Precision</w:t>
-      </w:r>
-    </w:p>
-    <w:p>
-      <w:pPr>
-        <w:numPr>
-          <w:ilvl w:val="0"/>
-          <w:numId w:val="19"/>
-        </w:numPr>
-      </w:pPr>
-      <w:r>
-        <w:t>Recall</w:t>
-      </w:r>
-    </w:p>
-    <w:p>
-      <w:pPr>
-        <w:numPr>
-          <w:ilvl w:val="0"/>
-          <w:numId w:val="19"/>
-        </w:numPr>
-      </w:pPr>
-      <w:r>
-        <w:t>F1-score</w:t>
-      </w:r>
-    </w:p>
-    <w:p>
-      <w:pPr>
-        <w:numPr>
-          <w:ilvl w:val="0"/>
-          <w:numId w:val="19"/>
-        </w:numPr>
-      </w:pPr>
-      <w:r>
-        <w:t>Confusion Matrix</w:t>
-      </w:r>
-    </w:p>
-    <w:p>
-      <w:r>
-        <w:t>Different models can also be compared to understand their performance on the same dataset.</w:t>
-      </w:r>
-    </w:p>
-    <w:p>
-      <w:pPr>
-        <w:rPr>
-          <w:b/>
-          <w:bCs/>
-        </w:rPr>
-      </w:pPr>
-      <w:r>
-        <w:rPr>
-          <w:b/>
-          <w:bCs/>
-        </w:rPr>
-        <w:t>14.4 Stronger Authentication</w:t>
-      </w:r>
-    </w:p>
-    <w:p>
-      <w:r>
-        <w:t>User authentication and authorization can be added to protect the dashboard and API.</w:t>
-      </w:r>
-    </w:p>
-    <w:p>
-      <w:pPr>
-        <w:rPr>
-          <w:b/>
-          <w:bCs/>
-        </w:rPr>
-      </w:pPr>
-      <w:r>
-        <w:rPr>
-          <w:b/>
-          <w:bCs/>
-        </w:rPr>
-        <w:t>14.5 Persistent Cloud Database</w:t>
-      </w:r>
-    </w:p>
-    <w:p>
-      <w:r>
-        <w:t>A managed cloud database can replace or supplement SQLite for production environments where persistent storage is required.</w:t>
-      </w:r>
-    </w:p>
-    <w:p>
-      <w:pPr>
-        <w:rPr>
-          <w:b/>
-          <w:bCs/>
-        </w:rPr>
-      </w:pPr>
-      <w:r>
-        <w:rPr>
-          <w:b/>
-          <w:bCs/>
-        </w:rPr>
-        <w:t>14.6 Improved Dashboard</w:t>
-      </w:r>
-    </w:p>
-    <w:p>
-      <w:r>
-        <w:t>The dashboard can be enhanced with:</w:t>
-      </w:r>
-    </w:p>
-    <w:p>
-      <w:pPr>
-        <w:numPr>
-          <w:ilvl w:val="0"/>
-          <w:numId w:val="20"/>
-        </w:numPr>
-      </w:pPr>
-      <w:r>
-        <w:t>Graphs</w:t>
-      </w:r>
-    </w:p>
-    <w:p>
-      <w:pPr>
-        <w:numPr>
-          <w:ilvl w:val="0"/>
-          <w:numId w:val="20"/>
-        </w:numPr>
-      </w:pPr>
-      <w:r>
-        <w:t>Threat statistics</w:t>
-      </w:r>
-    </w:p>
-    <w:p>
-      <w:pPr>
-        <w:numPr>
-          <w:ilvl w:val="0"/>
-          <w:numId w:val="20"/>
-        </w:numPr>
-      </w:pPr>
-      <w:r>
-        <w:t>Historical detection records</w:t>
-      </w:r>
-    </w:p>
-    <w:p>
-      <w:pPr>
-        <w:numPr>
-          <w:ilvl w:val="0"/>
-          <w:numId w:val="20"/>
-        </w:numPr>
-      </w:pPr>
-      <w:r>
-        <w:t>Traffic trends</w:t>
-      </w:r>
-    </w:p>
-    <w:p>
-      <w:pPr>
-        <w:numPr>
-          <w:ilvl w:val="0"/>
-          <w:numId w:val="20"/>
-        </w:numPr>
-      </w:pPr>
-      <w:r>
-        <w:t>Detection summaries</w:t>
-      </w:r>
-    </w:p>
-    <w:p>
-      <w:pPr>
-        <w:numPr>
-          <w:ilvl w:val="0"/>
-          <w:numId w:val="20"/>
-        </w:numPr>
-      </w:pPr>
-      <w:r>
-        <w:t>Alerts</w:t>
-      </w:r>
-    </w:p>
-    <w:p>
-      <w:pPr>
-        <w:rPr>
-          <w:b/>
-          <w:bCs/>
-        </w:rPr>
-      </w:pPr>
-      <w:r>
-        <w:rPr>
-          <w:b/>
-          <w:bCs/>
-        </w:rPr>
-        <w:t>14.7 Detailed Threat Classification</w:t>
-      </w:r>
-    </w:p>
-    <w:p>
-      <w:r>
-        <w:t>Instead of only:</w:t>
-      </w:r>
-    </w:p>
-    <w:p>
-      <w:r>
-        <w:rPr>
-          <w:b/>
-          <w:bCs/>
-        </w:rPr>
-        <w:t>Normal / Threat</w:t>
-      </w:r>
-    </w:p>
-    <w:p>
-      <w:r>
-        <w:t>future versions could identify different categories of network attacks.</w:t>
-      </w:r>
-    </w:p>
-    <w:p>
-      <w:pPr>
-        <w:rPr>
-          <w:b/>
-          <w:bCs/>
-        </w:rPr>
-      </w:pPr>
-      <w:r>
-        <w:rPr>
-          <w:b/>
-          <w:bCs/>
-        </w:rPr>
-        <w:t>14.8 Advanced Threat Detection</w:t>
-      </w:r>
-    </w:p>
-    <w:p>
-      <w:r>
-        <w:t>Future versions can explore:</w:t>
+        <w:t>Deep Learning</w:t>
       </w:r>
     </w:p>
     <w:p>
@@ -5536,7 +5467,7 @@
         </w:numPr>
       </w:pPr>
       <w:r>
-        <w:t>Anomaly detection</w:t>
+        <w:t>Ensemble techniques</w:t>
       </w:r>
     </w:p>
     <w:p>
@@ -5547,29 +5478,6 @@
         </w:numPr>
       </w:pPr>
       <w:r>
-        <w:t>Deep Learning</w:t>
-      </w:r>
-    </w:p>
-    <w:p>
-      <w:pPr>
-        <w:numPr>
-          <w:ilvl w:val="0"/>
-          <w:numId w:val="21"/>
-        </w:numPr>
-      </w:pPr>
-      <w:r>
-        <w:t>Ensemble techniques</w:t>
-      </w:r>
-    </w:p>
-    <w:p>
-      <w:pPr>
-        <w:numPr>
-          <w:ilvl w:val="0"/>
-          <w:numId w:val="21"/>
-        </w:numPr>
-      </w:pPr>
-      <w:r>
-        <w:lastRenderedPageBreak/>
         <w:t>Continuous monitoring</w:t>
       </w:r>
     </w:p>
@@ -5782,12 +5690,12 @@
     </w:p>
     <w:p>
       <w:r>
+        <w:lastRenderedPageBreak/>
         <w:t>The current prototype has limitations because it uses a small/synthetic dataset and a limited number of features. Therefore, future development should focus on larger real-world datasets, stronger evaluation, additional network features, improved security, persistent storage, and more advanced threat detection methods.</w:t>
       </w:r>
     </w:p>
     <w:p>
       <w:r>
-        <w:lastRenderedPageBreak/>
         <w:pict w14:anchorId="6E45C13B">
           <v:rect id="_x0000_i1161" style="width:0;height:1.5pt" o:hralign="center" o:hrstd="t" o:hr="t" fillcolor="#a0a0a0" stroked="f"/>
         </w:pict>
@@ -6102,6 +6010,7 @@
           <w:b/>
           <w:bCs/>
         </w:rPr>
+        <w:lastRenderedPageBreak/>
         <w:t>APPENDIX B — SUGGESTED PROJECT SCREENSHOTS</w:t>
       </w:r>
     </w:p>
@@ -6127,7 +6036,6 @@
     </w:p>
     <w:p>
       <w:r>
-        <w:lastRenderedPageBreak/>
         <w:t>Add your actual dashboard screenshot showing:</w:t>
       </w:r>
     </w:p>
@@ -6315,6 +6223,7 @@
     </w:p>
     <w:p>
       <w:r>
+        <w:lastRenderedPageBreak/>
         <w:t xml:space="preserve">                                          Alert</w:t>
       </w:r>
     </w:p>
@@ -6330,7 +6239,6 @@
     </w:p>
     <w:p>
       <w:r>
-        <w:lastRenderedPageBreak/>
         <w:t xml:space="preserve">                                            ↓</w:t>
       </w:r>
     </w:p>

</xml_diff>